<commit_message>
everything working as it should, ready to refactor
</commit_message>
<xml_diff>
--- a/PM 3425 ReportInputsTemplate.docx
+++ b/PM 3425 ReportInputsTemplate.docx
@@ -58,14 +58,16 @@
                 <w:szCs w:val="22"/>
               </w:rPr>
             </w:pPr>
+            <w:proofErr w:type="spellStart"/>
             <w:r>
               <w:rPr>
                 <w:bCs/>
                 <w:sz w:val="22"/>
                 <w:szCs w:val="22"/>
               </w:rPr>
-              <w:t>Customer Today</w:t>
-            </w:r>
+              <w:t>Clifty</w:t>
+            </w:r>
+            <w:proofErr w:type="spellEnd"/>
           </w:p>
         </w:tc>
         <w:tc>
@@ -110,7 +112,14 @@
                 <w:sz w:val="22"/>
                 <w:szCs w:val="22"/>
               </w:rPr>
-              <w:t>Subject Today</w:t>
+              <w:t xml:space="preserve">Subject </w:t>
+            </w:r>
+            <w:r>
+              <w:rPr>
+                <w:sz w:val="22"/>
+                <w:szCs w:val="22"/>
+              </w:rPr>
+              <w:t>10/27/2024</w:t>
             </w:r>
           </w:p>
         </w:tc>
@@ -162,7 +171,7 @@
                 <w:sz w:val="22"/>
                 <w:szCs w:val="22"/>
               </w:rPr>
-              <w:t>Customer Address Today</w:t>
+              <w:t>Abbey Road 101</w:t>
             </w:r>
           </w:p>
         </w:tc>
@@ -208,7 +217,14 @@
                 <w:sz w:val="22"/>
                 <w:szCs w:val="22"/>
               </w:rPr>
-              <w:t>From Today</w:t>
+              <w:t xml:space="preserve">From </w:t>
+            </w:r>
+            <w:r>
+              <w:rPr>
+                <w:sz w:val="22"/>
+                <w:szCs w:val="22"/>
+              </w:rPr>
+              <w:t>10/27/2024</w:t>
             </w:r>
           </w:p>
         </w:tc>
@@ -260,7 +276,7 @@
                 <w:sz w:val="22"/>
                 <w:szCs w:val="22"/>
               </w:rPr>
-              <w:t>Customer Contact Today</w:t>
+              <w:t>John Doe</w:t>
             </w:r>
           </w:p>
         </w:tc>
@@ -308,7 +324,15 @@
                 <w:sz w:val="22"/>
                 <w:szCs w:val="22"/>
               </w:rPr>
-              <w:t>Company Today</w:t>
+              <w:t xml:space="preserve">Company </w:t>
+            </w:r>
+            <w:r>
+              <w:rPr>
+                <w:bCs/>
+                <w:sz w:val="22"/>
+                <w:szCs w:val="22"/>
+              </w:rPr>
+              <w:t>10/27/2024</w:t>
             </w:r>
           </w:p>
         </w:tc>
@@ -362,7 +386,7 @@
                 <w:sz w:val="22"/>
                 <w:szCs w:val="22"/>
               </w:rPr>
-              <w:t>Inspection Site Today</w:t>
+              <w:t>Somewhere in Indiana</w:t>
             </w:r>
           </w:p>
         </w:tc>
@@ -422,7 +446,7 @@
                 <w:sz w:val="22"/>
                 <w:szCs w:val="22"/>
               </w:rPr>
-              <w:t>1-800-2424-69</w:t>
+              <w:t>800-2424-69</w:t>
             </w:r>
           </w:p>
           <w:p>
@@ -452,7 +476,7 @@
                 <w:sz w:val="22"/>
                 <w:szCs w:val="22"/>
               </w:rPr>
-              <w:t>emailtoday</w:t>
+              <w:t>email</w:t>
             </w:r>
             <w:r>
               <w:rPr>
@@ -511,7 +535,7 @@
                 <w:sz w:val="22"/>
                 <w:szCs w:val="22"/>
               </w:rPr>
-              <w:t>2424</w:t>
+              <w:t>69</w:t>
             </w:r>
             <w:r>
               <w:rPr>
@@ -540,6 +564,13 @@
                 <w:szCs w:val="22"/>
               </w:rPr>
               <w:t>420</w:t>
+            </w:r>
+            <w:r>
+              <w:rPr>
+                <w:sz w:val="22"/>
+                <w:szCs w:val="22"/>
+              </w:rPr>
+              <w:t>-duh</w:t>
             </w:r>
           </w:p>
         </w:tc>
@@ -592,6 +623,20 @@
                 <w:szCs w:val="22"/>
               </w:rPr>
               <w:t>3425</w:t>
+            </w:r>
+            <w:r>
+              <w:rPr>
+                <w:sz w:val="22"/>
+                <w:szCs w:val="22"/>
+              </w:rPr>
+              <w:t>-</w:t>
+            </w:r>
+            <w:r>
+              <w:rPr>
+                <w:sz w:val="22"/>
+                <w:szCs w:val="22"/>
+              </w:rPr>
+              <w:t>idk</w:t>
             </w:r>
           </w:p>
         </w:tc>
@@ -643,7 +688,7 @@
                 <w:sz w:val="22"/>
                 <w:szCs w:val="22"/>
               </w:rPr>
-              <w:t>Customer CCs Today</w:t>
+              <w:t>I don’t know</w:t>
             </w:r>
           </w:p>
         </w:tc>
@@ -718,6 +763,20 @@
                 <w:szCs w:val="22"/>
               </w:rPr>
               <w:t>CTO</w:t>
+            </w:r>
+            <w:r>
+              <w:rPr>
+                <w:sz w:val="22"/>
+                <w:szCs w:val="22"/>
+              </w:rPr>
+              <w:t xml:space="preserve"> the b</w:t>
+            </w:r>
+            <w:r>
+              <w:rPr>
+                <w:sz w:val="22"/>
+                <w:szCs w:val="22"/>
+              </w:rPr>
+              <w:t>est</w:t>
             </w:r>
           </w:p>
         </w:tc>
@@ -782,7 +841,7 @@
                 <w:sz w:val="22"/>
                 <w:szCs w:val="22"/>
               </w:rPr>
-              <w:t>01</w:t>
+              <w:t>27</w:t>
             </w:r>
             <w:r>
               <w:rPr>
@@ -848,7 +907,7 @@
                 <w:sz w:val="22"/>
                 <w:szCs w:val="22"/>
               </w:rPr>
-              <w:t>26</w:t>
+              <w:t>27</w:t>
             </w:r>
             <w:r>
               <w:rPr>
@@ -908,7 +967,14 @@
                 <w:sz w:val="22"/>
                 <w:szCs w:val="22"/>
               </w:rPr>
-              <w:t>Introduction Today</w:t>
+              <w:t xml:space="preserve">Introduction </w:t>
+            </w:r>
+            <w:r>
+              <w:rPr>
+                <w:sz w:val="22"/>
+                <w:szCs w:val="22"/>
+              </w:rPr>
+              <w:t>10/27/2024</w:t>
             </w:r>
           </w:p>
         </w:tc>
@@ -961,7 +1027,14 @@
                 <w:sz w:val="22"/>
                 <w:szCs w:val="22"/>
               </w:rPr>
-              <w:t>Entrance Meeting Today</w:t>
+              <w:t xml:space="preserve">Entrance Meeting </w:t>
+            </w:r>
+            <w:r>
+              <w:rPr>
+                <w:sz w:val="22"/>
+                <w:szCs w:val="22"/>
+              </w:rPr>
+              <w:t>10/27/2024</w:t>
             </w:r>
           </w:p>
         </w:tc>
@@ -1023,7 +1096,7 @@
                 <w:sz w:val="22"/>
                 <w:szCs w:val="22"/>
               </w:rPr>
-              <w:t>Drawing 1 Today</w:t>
+              <w:t>68fgklsf</w:t>
             </w:r>
           </w:p>
         </w:tc>
@@ -1047,27 +1120,15 @@
                 <w:szCs w:val="22"/>
               </w:rPr>
             </w:pPr>
-            <w:r>
-              <w:rPr>
-                <w:sz w:val="22"/>
-                <w:szCs w:val="22"/>
-              </w:rPr>
-              <w:t xml:space="preserve">Drawing </w:t>
-            </w:r>
-            <w:r>
-              <w:rPr>
-                <w:sz w:val="22"/>
-                <w:szCs w:val="22"/>
-              </w:rPr>
-              <w:t>2</w:t>
-            </w:r>
-            <w:r>
-              <w:rPr>
-                <w:sz w:val="22"/>
-                <w:szCs w:val="22"/>
-              </w:rPr>
-              <w:t xml:space="preserve"> Today</w:t>
-            </w:r>
+            <w:proofErr w:type="spellStart"/>
+            <w:r>
+              <w:rPr>
+                <w:sz w:val="22"/>
+                <w:szCs w:val="22"/>
+              </w:rPr>
+              <w:t>adjnalnal</w:t>
+            </w:r>
+            <w:proofErr w:type="spellEnd"/>
           </w:p>
         </w:tc>
       </w:tr>
@@ -1090,27 +1151,15 @@
                 <w:szCs w:val="22"/>
               </w:rPr>
             </w:pPr>
-            <w:r>
-              <w:rPr>
-                <w:sz w:val="22"/>
-                <w:szCs w:val="22"/>
-              </w:rPr>
-              <w:t xml:space="preserve">Drawing </w:t>
-            </w:r>
-            <w:r>
-              <w:rPr>
-                <w:sz w:val="22"/>
-                <w:szCs w:val="22"/>
-              </w:rPr>
-              <w:t>3</w:t>
-            </w:r>
-            <w:r>
-              <w:rPr>
-                <w:sz w:val="22"/>
-                <w:szCs w:val="22"/>
-              </w:rPr>
-              <w:t xml:space="preserve"> Today</w:t>
-            </w:r>
+            <w:proofErr w:type="spellStart"/>
+            <w:r>
+              <w:rPr>
+                <w:sz w:val="22"/>
+                <w:szCs w:val="22"/>
+              </w:rPr>
+              <w:t>adfadf</w:t>
+            </w:r>
+            <w:proofErr w:type="spellEnd"/>
           </w:p>
         </w:tc>
       </w:tr>
@@ -1133,27 +1182,15 @@
                 <w:szCs w:val="22"/>
               </w:rPr>
             </w:pPr>
-            <w:r>
-              <w:rPr>
-                <w:sz w:val="22"/>
-                <w:szCs w:val="22"/>
-              </w:rPr>
-              <w:t xml:space="preserve">Drawing </w:t>
-            </w:r>
-            <w:r>
-              <w:rPr>
-                <w:sz w:val="22"/>
-                <w:szCs w:val="22"/>
-              </w:rPr>
-              <w:t>4</w:t>
-            </w:r>
-            <w:r>
-              <w:rPr>
-                <w:sz w:val="22"/>
-                <w:szCs w:val="22"/>
-              </w:rPr>
-              <w:t xml:space="preserve"> Today</w:t>
-            </w:r>
+            <w:proofErr w:type="spellStart"/>
+            <w:r>
+              <w:rPr>
+                <w:sz w:val="22"/>
+                <w:szCs w:val="22"/>
+              </w:rPr>
+              <w:t>adfasdf</w:t>
+            </w:r>
+            <w:proofErr w:type="spellEnd"/>
           </w:p>
         </w:tc>
       </w:tr>
@@ -1209,13 +1246,15 @@
                 <w:szCs w:val="22"/>
               </w:rPr>
             </w:pPr>
-            <w:r>
-              <w:rPr>
-                <w:sz w:val="22"/>
-                <w:szCs w:val="22"/>
-              </w:rPr>
-              <w:t>Specification 1 Today</w:t>
-            </w:r>
+            <w:proofErr w:type="spellStart"/>
+            <w:r>
+              <w:rPr>
+                <w:sz w:val="22"/>
+                <w:szCs w:val="22"/>
+              </w:rPr>
+              <w:t>asdfasfd</w:t>
+            </w:r>
+            <w:proofErr w:type="spellEnd"/>
           </w:p>
         </w:tc>
       </w:tr>
@@ -1238,27 +1277,15 @@
                 <w:szCs w:val="22"/>
               </w:rPr>
             </w:pPr>
-            <w:r>
-              <w:rPr>
-                <w:sz w:val="22"/>
-                <w:szCs w:val="22"/>
-              </w:rPr>
-              <w:t xml:space="preserve">Specification </w:t>
-            </w:r>
-            <w:r>
-              <w:rPr>
-                <w:sz w:val="22"/>
-                <w:szCs w:val="22"/>
-              </w:rPr>
-              <w:t>2</w:t>
-            </w:r>
-            <w:r>
-              <w:rPr>
-                <w:sz w:val="22"/>
-                <w:szCs w:val="22"/>
-              </w:rPr>
-              <w:t xml:space="preserve"> Today</w:t>
-            </w:r>
+            <w:proofErr w:type="spellStart"/>
+            <w:r>
+              <w:rPr>
+                <w:sz w:val="22"/>
+                <w:szCs w:val="22"/>
+              </w:rPr>
+              <w:t>adfasdf</w:t>
+            </w:r>
+            <w:proofErr w:type="spellEnd"/>
           </w:p>
         </w:tc>
       </w:tr>
@@ -1281,27 +1308,15 @@
                 <w:szCs w:val="22"/>
               </w:rPr>
             </w:pPr>
-            <w:r>
-              <w:rPr>
-                <w:sz w:val="22"/>
-                <w:szCs w:val="22"/>
-              </w:rPr>
-              <w:t xml:space="preserve">Specification </w:t>
-            </w:r>
-            <w:r>
-              <w:rPr>
-                <w:sz w:val="22"/>
-                <w:szCs w:val="22"/>
-              </w:rPr>
-              <w:t>3</w:t>
-            </w:r>
-            <w:r>
-              <w:rPr>
-                <w:sz w:val="22"/>
-                <w:szCs w:val="22"/>
-              </w:rPr>
-              <w:t xml:space="preserve"> Today</w:t>
-            </w:r>
+            <w:proofErr w:type="spellStart"/>
+            <w:r>
+              <w:rPr>
+                <w:sz w:val="22"/>
+                <w:szCs w:val="22"/>
+              </w:rPr>
+              <w:t>adfasdfas</w:t>
+            </w:r>
+            <w:proofErr w:type="spellEnd"/>
           </w:p>
         </w:tc>
       </w:tr>
@@ -1352,7 +1367,14 @@
                 <w:sz w:val="22"/>
                 <w:szCs w:val="22"/>
               </w:rPr>
-              <w:t>Conclusions and Recommendations Today</w:t>
+              <w:t xml:space="preserve">Conclusions and Recommendations </w:t>
+            </w:r>
+            <w:r>
+              <w:rPr>
+                <w:sz w:val="22"/>
+                <w:szCs w:val="22"/>
+              </w:rPr>
+              <w:t>10/27/2024</w:t>
             </w:r>
           </w:p>
         </w:tc>
@@ -1637,15 +1659,7 @@
                 <w:sz w:val="22"/>
                 <w:szCs w:val="22"/>
               </w:rPr>
-              <w:t xml:space="preserve">Description </w:t>
-            </w:r>
-            <w:r>
-              <w:rPr>
-                <w:rFonts w:ascii="Calibri" w:hAnsi="Calibri" w:cs="Calibri"/>
-                <w:sz w:val="22"/>
-                <w:szCs w:val="22"/>
-              </w:rPr>
-              <w:t>2</w:t>
+              <w:t>Description 2</w:t>
             </w:r>
           </w:p>
         </w:tc>
@@ -1779,15 +1793,7 @@
                 <w:szCs w:val="22"/>
               </w:rPr>
               <w:lastRenderedPageBreak/>
-              <w:t xml:space="preserve">Description </w:t>
-            </w:r>
-            <w:r>
-              <w:rPr>
-                <w:rFonts w:ascii="Calibri" w:hAnsi="Calibri" w:cs="Calibri"/>
-                <w:sz w:val="22"/>
-                <w:szCs w:val="22"/>
-              </w:rPr>
-              <w:t>3</w:t>
+              <w:t>Description 3</w:t>
             </w:r>
           </w:p>
         </w:tc>
@@ -1915,15 +1921,7 @@
                 <w:sz w:val="22"/>
                 <w:szCs w:val="22"/>
               </w:rPr>
-              <w:t xml:space="preserve">Description </w:t>
-            </w:r>
-            <w:r>
-              <w:rPr>
-                <w:rFonts w:ascii="Calibri" w:hAnsi="Calibri" w:cs="Calibri"/>
-                <w:sz w:val="22"/>
-                <w:szCs w:val="22"/>
-              </w:rPr>
-              <w:t>4</w:t>
+              <w:t>Description 4</w:t>
             </w:r>
           </w:p>
         </w:tc>
@@ -2051,15 +2049,7 @@
                 <w:sz w:val="22"/>
                 <w:szCs w:val="22"/>
               </w:rPr>
-              <w:t xml:space="preserve">Description </w:t>
-            </w:r>
-            <w:r>
-              <w:rPr>
-                <w:rFonts w:ascii="Calibri" w:hAnsi="Calibri" w:cs="Calibri"/>
-                <w:sz w:val="22"/>
-                <w:szCs w:val="22"/>
-              </w:rPr>
-              <w:t>5</w:t>
+              <w:t>Description 5</w:t>
             </w:r>
           </w:p>
         </w:tc>
@@ -2188,15 +2178,7 @@
                 <w:szCs w:val="22"/>
               </w:rPr>
               <w:lastRenderedPageBreak/>
-              <w:t xml:space="preserve">Description </w:t>
-            </w:r>
-            <w:r>
-              <w:rPr>
-                <w:rFonts w:ascii="Calibri" w:hAnsi="Calibri" w:cs="Calibri"/>
-                <w:sz w:val="22"/>
-                <w:szCs w:val="22"/>
-              </w:rPr>
-              <w:t>6</w:t>
+              <w:t>Description 6</w:t>
             </w:r>
           </w:p>
         </w:tc>
@@ -2327,15 +2309,7 @@
                 <w:sz w:val="22"/>
                 <w:szCs w:val="22"/>
               </w:rPr>
-              <w:t xml:space="preserve">Description </w:t>
-            </w:r>
-            <w:r>
-              <w:rPr>
-                <w:rFonts w:ascii="Calibri" w:hAnsi="Calibri" w:cs="Calibri"/>
-                <w:sz w:val="22"/>
-                <w:szCs w:val="22"/>
-              </w:rPr>
-              <w:t>7</w:t>
+              <w:t>Description 7</w:t>
             </w:r>
           </w:p>
         </w:tc>
@@ -2470,15 +2444,7 @@
                 <w:sz w:val="22"/>
                 <w:szCs w:val="22"/>
               </w:rPr>
-              <w:t xml:space="preserve">Description </w:t>
-            </w:r>
-            <w:r>
-              <w:rPr>
-                <w:rFonts w:ascii="Calibri" w:hAnsi="Calibri" w:cs="Calibri"/>
-                <w:sz w:val="22"/>
-                <w:szCs w:val="22"/>
-              </w:rPr>
-              <w:t>8</w:t>
+              <w:t>Description 8</w:t>
             </w:r>
           </w:p>
         </w:tc>
@@ -2614,15 +2580,7 @@
                 <w:szCs w:val="22"/>
               </w:rPr>
               <w:lastRenderedPageBreak/>
-              <w:t xml:space="preserve">Description </w:t>
-            </w:r>
-            <w:r>
-              <w:rPr>
-                <w:rFonts w:ascii="Calibri" w:hAnsi="Calibri" w:cs="Calibri"/>
-                <w:sz w:val="22"/>
-                <w:szCs w:val="22"/>
-              </w:rPr>
-              <w:t>9</w:t>
+              <w:t>Description 9</w:t>
             </w:r>
             <w:r>
               <w:rPr>
@@ -2909,15 +2867,7 @@
                 <w:sz w:val="22"/>
                 <w:szCs w:val="22"/>
               </w:rPr>
-              <w:t>Description 1</w:t>
-            </w:r>
-            <w:r>
-              <w:rPr>
-                <w:rFonts w:ascii="Calibri" w:hAnsi="Calibri" w:cs="Calibri"/>
-                <w:sz w:val="22"/>
-                <w:szCs w:val="22"/>
-              </w:rPr>
-              <w:t>1</w:t>
+              <w:t>Description 11</w:t>
             </w:r>
           </w:p>
         </w:tc>
@@ -3053,15 +3003,7 @@
                 <w:szCs w:val="22"/>
               </w:rPr>
               <w:lastRenderedPageBreak/>
-              <w:t>Description 1</w:t>
-            </w:r>
-            <w:r>
-              <w:rPr>
-                <w:rFonts w:ascii="Calibri" w:hAnsi="Calibri" w:cs="Calibri"/>
-                <w:sz w:val="22"/>
-                <w:szCs w:val="22"/>
-              </w:rPr>
-              <w:t>2</w:t>
+              <w:t>Description 12</w:t>
             </w:r>
           </w:p>
         </w:tc>
@@ -3194,15 +3136,7 @@
                 <w:sz w:val="22"/>
                 <w:szCs w:val="22"/>
               </w:rPr>
-              <w:t>Description 1</w:t>
-            </w:r>
-            <w:r>
-              <w:rPr>
-                <w:rFonts w:ascii="Calibri" w:hAnsi="Calibri" w:cs="Calibri"/>
-                <w:sz w:val="22"/>
-                <w:szCs w:val="22"/>
-              </w:rPr>
-              <w:t>3</w:t>
+              <w:t>Description 13</w:t>
             </w:r>
           </w:p>
         </w:tc>
@@ -3332,15 +3266,7 @@
                 <w:sz w:val="22"/>
                 <w:szCs w:val="22"/>
               </w:rPr>
-              <w:t>Description 1</w:t>
-            </w:r>
-            <w:r>
-              <w:rPr>
-                <w:rFonts w:ascii="Calibri" w:hAnsi="Calibri" w:cs="Calibri"/>
-                <w:sz w:val="22"/>
-                <w:szCs w:val="22"/>
-              </w:rPr>
-              <w:t>4</w:t>
+              <w:t>Description 14</w:t>
             </w:r>
           </w:p>
         </w:tc>

</xml_diff>